<commit_message>
Reframe around surfacing detailed reviews; add t5-small summarizer for memory testing
</commit_message>
<xml_diff>
--- a/Project_Documentation.docx
+++ b/Project_Documentation.docx
@@ -76,7 +76,7 @@
           <w:sz w:val="20"/>
           <w:szCs w:val="20"/>
         </w:rPr>
-        <w:t xml:space="preserve">Steam's aggregate review score weights every review equally: a one-word "good game," a meme, and a considered critique all count the same toward a game's public score. This makes it hard to tell whether a score reflects genuine community sentiment or is diluted by low-effort noise. Steam applies some internal filtering, but never surfaces a "real sentiment" number to users. Left unaddressed, this means purchase decisions and developer feedback both rest on a metric that can be skewed by quick, low-substance reviews. No published prior work solving this specific problem for Steam was identified.</w:t>
+        <w:t xml:space="preserve">A one-word Steam review — "good game," "bad," "10/10" — records a vote but explains nothing: no gameplay mechanics, no bugs, no pacing, nothing that helps another player judge whether the game is actually for them. These thin reviews sit alongside genuinely informative ones at roughly equal visibility in Steam's review list, and both count identically toward the aggregate score. That makes it harder for a prospective buyer to find the reviews that would actually inform a purchase decision, and harder for developers to separate substantive feedback from noise. Steam applies some internal filtering, but never surfaces the substantive reviews specifically, nor a "real sentiment" number. Left unaddressed, purchase decisions and developer feedback both rest on a review list where detail is buried rather than surfaced. No published prior work solving this specific problem for Steam was identified.</w:t>
       </w:r>
     </w:p>
     <w:p>
@@ -141,7 +141,7 @@
           <w:sz w:val="20"/>
           <w:szCs w:val="20"/>
         </w:rPr>
-        <w:t xml:space="preserve">Players deciding whether to buy a game — want a score that reflects genuine opinion, not noise.</w:t>
+        <w:t xml:space="preserve">Players deciding whether to buy a game — want real detail (gameplay, bugs, pacing, value) to judge fit, not just a vote count or a blended score.</w:t>
       </w:r>
     </w:p>
     <w:p>
@@ -159,7 +159,7 @@
           <w:sz w:val="20"/>
           <w:szCs w:val="20"/>
         </w:rPr>
-        <w:t xml:space="preserve">Developers and publishers — want an honest read on sentiment, especially after a patch, price change, or controversy, when low-effort review volume spikes.</w:t>
+        <w:t xml:space="preserve">Developers and publishers — want genuine, substantive feedback surfaced clearly, especially after a patch, price change, or controversy, when low-effort review volume spikes.</w:t>
       </w:r>
     </w:p>
     <w:p>
@@ -177,7 +177,7 @@
           <w:sz w:val="20"/>
           <w:szCs w:val="20"/>
         </w:rPr>
-        <w:t xml:space="preserve">Steam itself — already filters some abuse; a transparent, text-only "real sentiment" score is a natural extension its own score doesn't currently provide.</w:t>
+        <w:t xml:space="preserve">Steam itself — already filters some abuse; surfacing the substantive reviews specifically, plus a transparent text-only "real sentiment" score, is a natural extension its own review list doesn't currently provide.</w:t>
       </w:r>
     </w:p>
     <w:p>
@@ -207,7 +207,7 @@
           <w:sz w:val="20"/>
           <w:szCs w:val="20"/>
         </w:rPr>
-        <w:t xml:space="preserve">Can a "real sentiment" score be produced for a game — one that filters out low-effort/junk reviews and reflects genuine community sentiment — using nothing but the review text? To be useful in practice, the quality filter needs precision high enough that genuine reviews are rarely misclassified as junk, and the sentiment model needs to track a reviewer's real vote closely enough to work as a trustworthy proxy where a vote isn't available. Section 8 covers how both models measure up against that bar.</w:t>
+        <w:t xml:space="preserve">Can the substantive reviews for a game be surfaced and the low-effort/junk ones filtered out, using nothing but the review text, so a player gets real detail to inform a buying decision? A secondary, supporting question: does that same filtering produce a "real sentiment" score that reflects genuine community sentiment more accurately than the raw aggregate? To be useful in practice, the quality filter needs precision high enough that genuine, substantive reviews are rarely misclassified as junk, and the sentiment model needs to track a reviewer's real vote closely enough to work as a trustworthy proxy where a vote isn't available. Section 8 covers how both models measure up against that bar.</w:t>
       </w:r>
     </w:p>
     <w:p>
@@ -2786,7 +2786,7 @@
           <w:sz w:val="20"/>
           <w:szCs w:val="20"/>
         </w:rPr>
-        <w:t xml:space="preserve">Filtering out low-effort reviews lowers the positive percentage for every one of the seven games — a consistent, non-obvious finding, because low-effort reviews skew more positive than substantive ones. Tekken 8 crosses a full Steam category ("Mixed" → "Mostly Negative", 47.6% → 39.2%), and so does Forza Horizon 5 ("Very Positive" → "Mostly Positive", 88.7% → 79.7%). The sentiment model's text-only prediction agrees with the reviewer's real vote 82–96% of the time depending on the game, confirming it is reading sentiment correctly rather than guessing.</w:t>
+        <w:t xml:space="preserve">The quality filter reliably separates thin, low-information reviews from substantive ones, which lets the app surface real detail to a prospective buyer instead of a raw, unsorted review list. As a secondary check on that filtering, the positive percentage drops for every one of the seven games once low-effort reviews are removed — a consistent, non-obvious finding, because low-effort reviews skew more positive than substantive ones. Tekken 8 crosses a full Steam category ("Mixed" → "Mostly Negative", 47.6% → 39.2%), and so does Forza Horizon 5 ("Very Positive" → "Mostly Positive", 88.7% → 79.7%). The sentiment model's text-only prediction agrees with the reviewer's real vote 82–96% of the time depending on the game, confirming it is reading sentiment correctly rather than guessing.</w:t>
       </w:r>
     </w:p>
     <w:p>
@@ -2816,7 +2816,7 @@
           <w:sz w:val="20"/>
           <w:szCs w:val="20"/>
         </w:rPr>
-        <w:t xml:space="preserve">Both trained models are packaged as portable artifacts — the CNN quality filter as a single .keras file (its vocabulary is baked into the model, so no separate vectorizer is needed at inference time), and the Stacking sentiment model plus its TF-IDF vectorizer as joblib files. The Streamlit app loads both and, for any game someone searches, pulls fresh reviews live, drops non-English content, scores with both models, and shows before/after and model-vs-Steam-vote comparisons. Per-request inference (~65ms for a 1,000-review batch) is negligible next to the multi-second Steam API call the app already makes. No GPU is needed in production — the CPU build of TensorFlow keeps the deployed footprint small enough for a free-tier host.</w:t>
+        <w:t xml:space="preserve">Both trained models are packaged as portable artifacts — the CNN quality filter as a single .keras file (its vocabulary is baked into the model, so no separate vectorizer is needed at inference time), and the Stacking sentiment model plus its TF-IDF vectorizer as joblib files. The Streamlit app loads both and, for any game someone searches, pulls fresh reviews live, drops non-English content, and scores with both models. The headline UI element is a curated sample of the longest substantive reviews on each side of the vote — the ones with enough detail to actually inform a buying decision — shown alongside the before/after sentiment score and model-vs-Steam-vote comparison. Per-request inference (~65ms for a 1,000-review batch) is negligible next to the multi-second Steam API call the app already makes. No GPU is needed in production — the CPU build of TensorFlow keeps the deployed footprint small enough for a free-tier host.</w:t>
       </w:r>
     </w:p>
     <w:p>
@@ -2876,7 +2876,7 @@
           <w:sz w:val="20"/>
           <w:szCs w:val="20"/>
         </w:rPr>
-        <w:t xml:space="preserve">The "real sentiment" score is defensible, and it reads consistently more critically than Steam's raw score once low-effort noise is removed — which is the point. That comes with a caveat worth stating plainly: it rests on a proxy label for "low-effort" rather than verified ground truth, and on a recent-reviews sample rather than a game's full history. Read that way, it's a more honest snapshot of current English-speaking sentiment, not a wholesale replacement for Steam's own aggregate.</w:t>
+        <w:t xml:space="preserve">Yes — the quality filter can reliably separate substantive reviews from thin ones, letting the app surface real detail (gameplay, bugs, pacing, value) instead of a raw, unsorted list. The resulting "real sentiment" score is a useful secondary check: it reads consistently more critically than Steam's raw score once low-effort noise is removed. That comes with a caveat worth stating plainly: the filter rests on a proxy label for "low-effort" rather than verified ground truth, and the sample reflects recent reviews rather than a game's full history. Read that way, this is a tool for finding informative reviews and getting a more honest sentiment snapshot — not a wholesale replacement for Steam's own aggregate.</w:t>
       </w:r>
     </w:p>
     <w:p>
@@ -2911,7 +2911,7 @@
           <w:sz w:val="20"/>
           <w:szCs w:val="20"/>
         </w:rPr>
-        <w:t xml:space="preserve">Players: use the filtered score alongside Steam's own — especially useful right after a patch, price change, or controversy, when low-effort review volume spikes and the raw score is most likely to be misleading.</w:t>
+        <w:t xml:space="preserve">Players: read the surfaced substantive reviews first for actual buying-decision detail, and use the filtered score alongside Steam's own as a secondary check — especially useful right after a patch, price change, or controversy, when low-effort review volume spikes and the raw score is most likely to be misleading.</w:t>
       </w:r>
     </w:p>
     <w:p>
@@ -2929,7 +2929,7 @@
           <w:sz w:val="20"/>
           <w:szCs w:val="20"/>
         </w:rPr>
-        <w:t xml:space="preserve">Developers/publishers: the filtered score and the flagged-review sample give a clearer read on genuine feedback than the raw aggregate, without needing to read thousands of reviews manually.</w:t>
+        <w:t xml:space="preserve">Developers/publishers: the surfaced substantive reviews and the filtered score give a clearer read on genuine feedback than the raw aggregate, without needing to read thousands of reviews manually.</w:t>
       </w:r>
     </w:p>
     <w:p>
@@ -2977,7 +2977,7 @@
           <w:sz w:val="20"/>
           <w:szCs w:val="20"/>
         </w:rPr>
-        <w:t xml:space="preserve">UI: Streamlit web app (game name or appid search, before/after comparison, flagged-review sample). Model: CNN (quality) + Stacking ensemble (sentiment), both trained via a reproducible src/train_models.py pipeline separated from the exploratory notebook. Data: Steam's public appreviews API, pulled live for any game, no re-training needed for new titles. Infrastructure: GitHub for source control and CI-free redeploy-on-push; Streamlit Community Cloud for hosting (free tier, sleeps when idle). Tools/libraries: Python, pandas, scikit-learn, TensorFlow/Keras, Streamlit, requests.</w:t>
+        <w:t xml:space="preserve">UI: Streamlit web app (game name or appid search, curated sample of substantive reviews on each side of the vote, before/after sentiment comparison, flagged-review sample for transparency). Model: CNN (quality) + Stacking ensemble (sentiment), both trained via a reproducible src/train_models.py pipeline separated from the exploratory notebook. Data: Steam's public appreviews API, pulled live for any game, no re-training needed for new titles. Infrastructure: GitHub for source control and CI-free redeploy-on-push; Streamlit Community Cloud for hosting (free tier, sleeps when idle). Tools/libraries: Python, pandas, scikit-learn, TensorFlow/Keras, Streamlit, requests.</w:t>
       </w:r>
     </w:p>
     <w:p>

</xml_diff>

<commit_message>
Update README, notebook, documentation, presentation, script for third (summarizer) model
</commit_message>
<xml_diff>
--- a/Project_Documentation.docx
+++ b/Project_Documentation.docx
@@ -2761,6 +2761,36 @@
     </w:p>
     <w:p>
       <w:pPr>
+        <w:pStyle w:val="Heading2"/>
+        <w:spacing w:after="40" w:before="100"/>
+      </w:pPr>
+      <w:r>
+        <w:rPr>
+          <w:rFonts w:ascii="Arial" w:cs="Arial" w:eastAsia="Arial" w:hAnsi="Arial"/>
+          <w:b/>
+          <w:bCs/>
+          <w:color w:val="2E74B5"/>
+          <w:sz w:val="24"/>
+          <w:szCs w:val="24"/>
+        </w:rPr>
+        <w:t xml:space="preserve">Model 3 — Summarization (bonus, beyond the two required)</w:t>
+      </w:r>
+    </w:p>
+    <w:p>
+      <w:pPr>
+        <w:spacing w:after="80"/>
+      </w:pPr>
+      <w:r>
+        <w:rPr>
+          <w:rFonts w:ascii="Arial" w:cs="Arial" w:eastAsia="Arial" w:hAnsi="Arial"/>
+          <w:sz w:val="20"/>
+          <w:szCs w:val="20"/>
+        </w:rPr>
+        <w:t xml:space="preserve">A pretrained t5-small (TensorFlow backend) condenses the surfaced positive and negative reviews into a couple of plain-English sentences per side, shown as an "In short" callout above the raw quotes. Summarized separately per side rather than blended — mixing praise and criticism in one prompt produced incoherent, repetitive output in early testing (e.g. "it's a powerful and powerful game"); generation uses beam search (num_beams=4) with no_repeat_ngram_size=3 to directly suppress that failure mode. Deployment memory was flagged as a real risk before shipping — an isolated local estimate suggested it might not fit Streamlit Community Cloud's free tier — so it was deployed to a separate app and scored against two real games live before merging in; no crash, no memory-related restart. t5-small is small and not instruction-tuned, so summaries are readable but occasionally rough, not polished or fact-checked.</w:t>
+      </w:r>
+    </w:p>
+    <w:p>
+      <w:pPr>
         <w:pStyle w:val="Heading1"/>
         <w:spacing w:after="70" w:before="160"/>
       </w:pPr>
@@ -2816,7 +2846,7 @@
           <w:sz w:val="20"/>
           <w:szCs w:val="20"/>
         </w:rPr>
-        <w:t xml:space="preserve">Both trained models are packaged as portable artifacts — the CNN quality filter as a single .keras file (its vocabulary is baked into the model, so no separate vectorizer is needed at inference time), and the Stacking sentiment model plus its TF-IDF vectorizer as joblib files. The Streamlit app loads both and, for any game someone searches, pulls fresh reviews live, drops non-English content, and scores with both models. The headline UI element is a curated sample of the longest substantive reviews on each side of the vote — the ones with enough detail to actually inform a buying decision — shown alongside the before/after sentiment score and model-vs-Steam-vote comparison. Per-request inference (~65ms for a 1,000-review batch) is negligible next to the multi-second Steam API call the app already makes. No GPU is needed in production — the CPU build of TensorFlow keeps the deployed footprint small enough for a free-tier host.</w:t>
+        <w:t xml:space="preserve">All three trained models are packaged as portable artifacts — the CNN quality filter as a single .keras file (its vocabulary is baked into the model, so no separate vectorizer is needed at inference time), the Stacking sentiment model plus its TF-IDF vectorizer as joblib files, and the summarizer loaded directly from its pretrained checkpoint. The Streamlit app loads all three and, for any game someone searches, pulls fresh reviews live, drops non-English content, and scores with the quality and sentiment models. The headline UI elements are the plain-English summary and a curated sample of the longest substantive reviews on each side of the vote — the ones with enough detail to actually inform a buying decision — shown alongside the before/after sentiment score and model-vs-Steam-vote comparison. Per-request inference (~65ms for a 1,000-review batch) is negligible next to the multi-second Steam API call the app already makes; the summarizer only ever runs on the ~6 already-filtered reviews shown in the UI, not the full batch, keeping it fast despite being a generative model. No GPU is needed in production — the CPU build of TensorFlow keeps the deployed footprint small enough for a free-tier host, confirmed by live testing on the actual deployment target rather than assumed.</w:t>
       </w:r>
     </w:p>
     <w:p>

</xml_diff>

<commit_message>
Replace generative summarizer with extractive liked/disliked phrase extraction
</commit_message>
<xml_diff>
--- a/Project_Documentation.docx
+++ b/Project_Documentation.docx
@@ -2786,7 +2786,7 @@
           <w:sz w:val="20"/>
           <w:szCs w:val="20"/>
         </w:rPr>
-        <w:t xml:space="preserve">A pretrained t5-small (TensorFlow backend) condenses the surfaced positive and negative reviews into a couple of plain-English sentences per side, shown as an "In short" callout above the raw quotes. Summarized separately per side rather than blended — mixing praise and criticism in one prompt produced incoherent, repetitive output in early testing (e.g. "it's a powerful and powerful game"); generation uses beam search (num_beams=4) with no_repeat_ngram_size=3 to directly suppress that failure mode. Deployment memory was flagged as a real risk before shipping — an isolated local estimate suggested it might not fit Streamlit Community Cloud's free tier — so it was deployed to a separate app and scored against two real games live before merging in; no crash, no memory-related restart. t5-small is small and not instruction-tuned, so summaries are readable but occasionally rough, not polished or fact-checked.</w:t>
+        <w:t xml:space="preserve">The app surfaces the phrases (TF-IDF) that most distinguish the positive kept reviews from the negative ones, rendered as "Players liked: X, Y, Z" / "Players disliked: A, B, C" — extractive, not generated. This followed four rejected attempts at a generative summarizer: t5-small (safe on memory, but copy-pasted raw fragments rather than condensing them), bart-large-cnn (~400M parameters, genuinely coherent output, but OOM-crashed a live throwaway deployment on its first real request), distilbart-cnn-12-6 (a dead end — ships only legacy PyTorch weights, no TensorFlow-native option without adding PyTorch as a second deep-learning framework), and flan-t5-base/flan-t5-small (the base model hallucinated a detail — "graphics" — present in none of the source reviews; the small model produced vague, one-sided text that ignored genuinely negative reviews in the input). The consistent pattern: at a size that actually fits a free-tier host's memory budget, no generative model tested stayed reliably grounded in what the reviews say. An extractive approach cannot hallucinate or drop half the sentiment, since every phrase shown is copied verbatim from an actual review, and it uses scikit-learn's TfidfVectorizer — already a project dependency — adding zero additional memory or deployment risk. Stopwords are filtered after n-gram extraction rather than passed to the vectorizer directly, since filtering first causes n-grams to be built across the resulting gaps, turning grammatical phrases like "bugs on launch, crashes" into the ungrammatical "bugs launch crashes."</w:t>
       </w:r>
     </w:p>
     <w:p>
@@ -2846,7 +2846,7 @@
           <w:sz w:val="20"/>
           <w:szCs w:val="20"/>
         </w:rPr>
-        <w:t xml:space="preserve">All three trained models are packaged as portable artifacts — the CNN quality filter as a single .keras file (its vocabulary is baked into the model, so no separate vectorizer is needed at inference time), the Stacking sentiment model plus its TF-IDF vectorizer as joblib files, and the summarizer loaded directly from its pretrained checkpoint. The Streamlit app loads all three and, for any game someone searches, pulls fresh reviews live, drops non-English content, and scores with the quality and sentiment models. The headline UI elements are the plain-English summary and a curated sample of the longest substantive reviews on each side of the vote — the ones with enough detail to actually inform a buying decision — shown alongside the before/after sentiment score and model-vs-Steam-vote comparison. Per-request inference (~65ms for a 1,000-review batch) is negligible next to the multi-second Steam API call the app already makes; the summarizer only ever runs on the ~6 already-filtered reviews shown in the UI, not the full batch, keeping it fast despite being a generative model. No GPU is needed in production — the CPU build of TensorFlow keeps the deployed footprint small enough for a free-tier host, confirmed by live testing on the actual deployment target rather than assumed.</w:t>
+        <w:t xml:space="preserve">The two trained models are packaged as portable artifacts — the CNN quality filter as a single .keras file (its vocabulary is baked into the model, so no separate vectorizer is needed at inference time), and the Stacking sentiment model plus its TF-IDF vectorizer as joblib files. The extractive summarizer needs no trained artifact at all — it fits a TF-IDF vectorizer fresh on each request's kept reviews using scikit-learn, already a project dependency. The Streamlit app loads the quality and sentiment models and, for any game someone searches, pulls fresh reviews live, drops non-English content, and scores with both. The headline UI elements are the "players liked/disliked" phrase summary and a curated sample of the longest substantive reviews on each side of the vote — the ones with enough detail to actually inform a buying decision — shown alongside the before/after sentiment score (led by Steam's own category label, e.g. "Mostly Positive", rather than the raw percentage) and model-vs-Steam-vote comparison. Per-request inference (~65ms for a 1,000-review batch) is negligible next to the multi-second Steam API call the app already makes; the summarizer only ever runs on the ~6 already-filtered reviews shown in the UI, not the full batch. No GPU is needed in production — the CPU build of TensorFlow keeps the deployed footprint small enough for a free-tier host.</w:t>
       </w:r>
     </w:p>
     <w:p>

</xml_diff>

<commit_message>
Document extractive summarizer limitations; add full-batch and sentiment-aware summarizer future work; goal reflection in deck
</commit_message>
<xml_diff>
--- a/Project_Documentation.docx
+++ b/Project_Documentation.docx
@@ -3096,7 +3096,61 @@
           <w:sz w:val="20"/>
           <w:szCs w:val="20"/>
         </w:rPr>
+        <w:t xml:space="preserve">The "Players liked/disliked" summary is extractive (TF-IDF phrases pulled from the ~6 longest kept reviews per game, not generated text, and not run across the full pulled batch). Quality is uneven: a proper noun (e.g. the developer's name) can surface on both the liked and disliked lists if it appears in reviews on both sides, and some phrases surfaced are vaguer ("different", "people") than others ("credits", "supplies") — TF-IDF ranks by statistical distinctiveness, not by a human judgement of which word is most informative.</w:t>
+      </w:r>
+    </w:p>
+    <w:p>
+      <w:pPr>
+        <w:pStyle w:val="ListParagraph"/>
+        <w:numPr>
+          <w:ilvl w:val="0"/>
+          <w:numId w:val="1"/>
+        </w:numPr>
+        <w:spacing w:after="30"/>
+      </w:pPr>
+      <w:r>
+        <w:rPr>
+          <w:rFonts w:ascii="Arial" w:cs="Arial" w:eastAsia="Arial" w:hAnsi="Arial"/>
+          <w:sz w:val="20"/>
+          <w:szCs w:val="20"/>
+        </w:rPr>
         <w:t xml:space="preserve">Next: validate against a broader genre spread; calibrate the flagging threshold against a specific precision/recall target; extend to other languages; evaluate a pretrained transformer for sentiment to catch sarcasm and mixed-signal reviews.</w:t>
+      </w:r>
+    </w:p>
+    <w:p>
+      <w:pPr>
+        <w:pStyle w:val="ListParagraph"/>
+        <w:numPr>
+          <w:ilvl w:val="0"/>
+          <w:numId w:val="1"/>
+        </w:numPr>
+        <w:spacing w:after="30"/>
+      </w:pPr>
+      <w:r>
+        <w:rPr>
+          <w:rFonts w:ascii="Arial" w:cs="Arial" w:eastAsia="Arial" w:hAnsi="Arial"/>
+          <w:sz w:val="20"/>
+          <w:szCs w:val="20"/>
+        </w:rPr>
+        <w:t xml:space="preserve">Next (summarization): a genuine sentiment-aware summarizer — a properly-sized, memory-safe generative model that can write real prose about what reviews say, rather than today's extractive keyword list. Four generative models were tried and rejected during this project (t5-small, bart-large-cnn, distilbart-cnn-12-6, flan-t5) for either producing ungrounded/hallucinated output or exceeding the free-tier host's memory budget — this remains open work.</w:t>
+      </w:r>
+    </w:p>
+    <w:p>
+      <w:pPr>
+        <w:pStyle w:val="ListParagraph"/>
+        <w:numPr>
+          <w:ilvl w:val="0"/>
+          <w:numId w:val="1"/>
+        </w:numPr>
+        <w:spacing w:after="30"/>
+      </w:pPr>
+      <w:r>
+        <w:rPr>
+          <w:rFonts w:ascii="Arial" w:cs="Arial" w:eastAsia="Arial" w:hAnsi="Arial"/>
+          <w:sz w:val="20"/>
+          <w:szCs w:val="20"/>
+        </w:rPr>
+        <w:t xml:space="preserve">Next (scope): extend filtering and summarization to the full pulled batch (up to 1,000 reviews), not just the curated ~6-review sample shown today. This was the original goal behind the summarization feature — giving a picture of what players broadly say, not just a handful of the longest reviews — and closing that gap is the clearest way to fully meet it.</w:t>
       </w:r>
     </w:p>
     <w:p>

</xml_diff>

<commit_message>
Swap summarizer to Falconsai/text_summarization (per-review generation), replacing the extractive TF-IDF approach
</commit_message>
<xml_diff>
--- a/Project_Documentation.docx
+++ b/Project_Documentation.docx
@@ -2786,7 +2786,7 @@
           <w:sz w:val="20"/>
           <w:szCs w:val="20"/>
         </w:rPr>
-        <w:t xml:space="preserve">The app surfaces the phrases (TF-IDF) that most distinguish the positive kept reviews from the negative ones, rendered as "Players liked: X, Y, Z" / "Players disliked: A, B, C" — extractive, not generated. This followed four rejected attempts at a generative summarizer: t5-small (safe on memory, but copy-pasted raw fragments rather than condensing them), bart-large-cnn (~400M parameters, genuinely coherent output, but OOM-crashed a live throwaway deployment on its first real request), distilbart-cnn-12-6 (a dead end — ships only legacy PyTorch weights, no TensorFlow-native option without adding PyTorch as a second deep-learning framework), and flan-t5-base/flan-t5-small (the base model hallucinated a detail — "graphics" — present in none of the source reviews; the small model produced vague, one-sided text that ignored genuinely negative reviews in the input). The consistent pattern: at a size that actually fits a free-tier host's memory budget, no generative model tested stayed reliably grounded in what the reviews say. An extractive approach cannot hallucinate or drop half the sentiment, since every phrase shown is copied verbatim from an actual review, and it uses scikit-learn's TfidfVectorizer — already a project dependency — adding zero additional memory or deployment risk. Stopwords are filtered after n-gram extraction rather than passed to the vectorizer directly, since filtering first causes n-grams to be built across the resulting gaps, turning grammatical phrases like "bugs on launch, crashes" into the ungrammatical "bugs launch crashes."</w:t>
+        <w:t xml:space="preserve">The app generates a plain-English "Players liked: ..." / "Players disliked: ..." summary from the kept reviews, using Falconsai/text_summarization — a t5-small checkpoint (60.5M parameters, 242MB) fine-tuned specifically for summarization. Getting here took five attempts. Four other pretrained summarizers were tried and rejected first: t5-small (generic, not summarization-tuned — safe on memory, but copy-pasted raw fragments rather than condensing them), bart-large-cnn (~400M parameters, genuinely coherent output, but OOM-crashed a live throwaway deployment on its first real request), distilbart-cnn-12-6 (a dead end before it even loaded — ships only legacy PyTorch weights, no TensorFlow-native option without adding PyTorch as a second deep-learning framework), and flan-t5-base/flan-t5-small (the base model hallucinated a detail — "graphics" — present in none of the source reviews; the small model produced vague, one-sided text that ignored genuinely negative reviews in the input). Given that pattern, the app briefly switched to an extractive TF-IDF phrase-list instead, which could not hallucinate but also could not produce real prose. Falconsai/text_summarization was tried next specifically because it shares generic t5-small's already-proven-safe memory footprint while being fine-tuned for the actual task; local testing showed coherent, hallucination-free output across multiple runs. One problem remained: summarizing several reviews in a single pass reliably dropped at least one review from the output entirely, the same failure mode that sank the original t5-small. The fix was method, not model — each kept review is summarized individually, then the short results are joined, guaranteeing every review is represented since none can be dropped once each gets its own generation pass.</w:t>
       </w:r>
     </w:p>
     <w:p>
@@ -2846,7 +2846,7 @@
           <w:sz w:val="20"/>
           <w:szCs w:val="20"/>
         </w:rPr>
-        <w:t xml:space="preserve">The two trained models are packaged as portable artifacts — the CNN quality filter as a single .keras file (its vocabulary is baked into the model, so no separate vectorizer is needed at inference time), and the Stacking sentiment model plus its TF-IDF vectorizer as joblib files. The extractive summarizer needs no trained artifact at all — it fits a TF-IDF vectorizer fresh on each request's kept reviews using scikit-learn, already a project dependency. The Streamlit app loads the quality and sentiment models and, for any game someone searches, pulls fresh reviews live, drops non-English content, and scores with both. The headline UI elements are the "players liked/disliked" phrase summary and a curated sample of the longest substantive reviews on each side of the vote — the ones with enough detail to actually inform a buying decision — shown alongside the before/after sentiment score (led by Steam's own category label, e.g. "Mostly Positive", rather than the raw percentage) and model-vs-Steam-vote comparison. Per-request inference (~65ms for a 1,000-review batch) is negligible next to the multi-second Steam API call the app already makes; the summarizer only ever runs on the ~6 already-filtered reviews shown in the UI, not the full batch. No GPU is needed in production — the CPU build of TensorFlow keeps the deployed footprint small enough for a free-tier host.</w:t>
+        <w:t xml:space="preserve">The two required models are packaged as portable artifacts — the CNN quality filter as a single .keras file (its vocabulary is baked into the model, so no separate vectorizer is needed at inference time), and the Stacking sentiment model plus its TF-IDF vectorizer as joblib files. The summarizer downloads its own pretrained weights (Falconsai/text_summarization, 242MB) from Hugging Face on first load rather than using a locally-trained artifact. The Streamlit app loads all three models and, for any game someone searches, pulls fresh reviews live, drops non-English content, and scores with both required models. The headline UI elements are the "players liked/disliked" generated summary and a curated sample of the longest substantive reviews on each side of the vote — the ones with enough detail to actually inform a buying decision — shown alongside the before/after sentiment score (led by Steam's own category label, e.g. "Mostly Positive", rather than the raw percentage) and model-vs-Steam-vote comparison. Per-request inference (~65ms for a 1,000-review batch) is negligible next to the multi-second Steam API call the app already makes; the summarizer only ever runs on the ~6 already-filtered reviews shown in the UI, not the full batch. No GPU is needed in production — the CPU build of TensorFlow keeps the deployed footprint small enough for a free-tier host.</w:t>
       </w:r>
     </w:p>
     <w:p>
@@ -3096,7 +3096,7 @@
           <w:sz w:val="20"/>
           <w:szCs w:val="20"/>
         </w:rPr>
-        <w:t xml:space="preserve">The "Players liked/disliked" summary is extractive (TF-IDF phrases pulled from the ~6 longest kept reviews per game, not generated text, and not run across the full pulled batch). Quality is uneven: a proper noun (e.g. the developer's name) can surface on both the liked and disliked lists if it appears in reviews on both sides, and some phrases surfaced are vaguer ("different", "people") than others ("credits", "supplies") — TF-IDF ranks by statistical distinctiveness, not by a human judgement of which word is most informative.</w:t>
+        <w:t xml:space="preserve">The "Players liked/disliked" summary is generated text (Falconsai/text_summarization, pulled from the ~6 longest kept reviews per game, not run across the full pulled batch), not extracted phrases — local testing across multiple runs showed no outright hallucination, but as generated prose it carries a weaker groundedness guarantee than literal extraction would. Each review is summarized individually and the results joined, so the output reads as several short sentences placed back-to-back rather than one fully unified paragraph — a deliberate trade-off to guarantee every review is represented.</w:t>
       </w:r>
     </w:p>
     <w:p>
@@ -3132,7 +3132,7 @@
           <w:sz w:val="20"/>
           <w:szCs w:val="20"/>
         </w:rPr>
-        <w:t xml:space="preserve">Next (summarization): a genuine sentiment-aware summarizer — a properly-sized, memory-safe generative model that can write real prose about what reviews say, rather than today's extractive keyword list. Four generative models were tried and rejected during this project (t5-small, bart-large-cnn, distilbart-cnn-12-6, flan-t5) for either producing ungrounded/hallucinated output or exceeding the free-tier host's memory budget — this remains open work.</w:t>
+        <w:t xml:space="preserve">Next (summarization): a summarizer that synthesizes across multiple reviews in one coherent pass, rather than joining independently-generated per-review summaries — the per-review approach was chosen deliberately to guarantee no review gets dropped, at some cost to how naturally the joined result flows. Five summarizer models were tried in total to reach the current approach (t5-small, bart-large-cnn, distilbart-cnn-12-6, flan-t5, and an interim extractive TF-IDF approach) before Falconsai/text_summarization was adopted.</w:t>
       </w:r>
     </w:p>
     <w:p>

</xml_diff>

<commit_message>
Add summarizer attempts comparison table to README and Project_Documentation
</commit_message>
<xml_diff>
--- a/Project_Documentation.docx
+++ b/Project_Documentation.docx
@@ -2786,7 +2786,609 @@
           <w:sz w:val="20"/>
           <w:szCs w:val="20"/>
         </w:rPr>
-        <w:t xml:space="preserve">The app generates a plain-English "Players liked: ..." / "Players disliked: ..." summary from the kept reviews, using Falconsai/text_summarization — a t5-small checkpoint (60.5M parameters, 242MB) fine-tuned specifically for summarization. Getting here took five attempts. Four other pretrained summarizers were tried and rejected first: t5-small (generic, not summarization-tuned — safe on memory, but copy-pasted raw fragments rather than condensing them), bart-large-cnn (~400M parameters, genuinely coherent output, but OOM-crashed a live throwaway deployment on its first real request), distilbart-cnn-12-6 (a dead end before it even loaded — ships only legacy PyTorch weights, no TensorFlow-native option without adding PyTorch as a second deep-learning framework), and flan-t5-base/flan-t5-small (the base model hallucinated a detail — "graphics" — present in none of the source reviews; the small model produced vague, one-sided text that ignored genuinely negative reviews in the input). Given that pattern, the app briefly switched to an extractive TF-IDF phrase-list instead, which could not hallucinate but also could not produce real prose. Falconsai/text_summarization was tried next specifically because it shares generic t5-small's already-proven-safe memory footprint while being fine-tuned for the actual task; local testing showed coherent, hallucination-free output across multiple runs. One problem remained: summarizing several reviews in a single pass reliably dropped at least one review from the output entirely, the same failure mode that sank the original t5-small. The fix was method, not model — each kept review is summarized individually, then the short results are joined, guaranteeing every review is represented since none can be dropped once each gets its own generation pass.</w:t>
+        <w:t xml:space="preserve">The app generates a plain-English "Players liked: ..." / "Players disliked: ..." summary from the kept reviews. This is a bonus feature, not a formally compared third model — there is no precision/recall/ROC-AUC to score a generated summary against, so unlike Models 1 and 2 above, what follows is a build log across seven attempts, not a metrics comparison:</w:t>
+      </w:r>
+    </w:p>
+    <w:tbl>
+      <w:tblPr>
+        <w:tblW w:type="dxa" w:w="9640"/>
+        <w:tblBorders>
+          <w:top w:val="single" w:color="auto" w:sz="4"/>
+          <w:left w:val="single" w:color="auto" w:sz="4"/>
+          <w:bottom w:val="single" w:color="auto" w:sz="4"/>
+          <w:right w:val="single" w:color="auto" w:sz="4"/>
+          <w:insideH w:val="single" w:color="auto" w:sz="4"/>
+          <w:insideV w:val="single" w:color="auto" w:sz="4"/>
+        </w:tblBorders>
+      </w:tblPr>
+      <w:tblGrid>
+        <w:gridCol w:w="2600"/>
+        <w:gridCol w:w="1800"/>
+        <w:gridCol w:w="5240"/>
+      </w:tblGrid>
+      <w:tr>
+        <w:tc>
+          <w:tcPr>
+            <w:tcW w:type="dxa" w:w="2600"/>
+            <w:shd w:fill="D9E6F2" w:val="clear"/>
+            <w:tcMar>
+              <w:top w:type="dxa" w:w="40"/>
+              <w:left w:type="dxa" w:w="80"/>
+              <w:bottom w:type="dxa" w:w="40"/>
+              <w:right w:type="dxa" w:w="80"/>
+            </w:tcMar>
+          </w:tcPr>
+          <w:p>
+            <w:r>
+              <w:rPr>
+                <w:rFonts w:ascii="Arial" w:cs="Arial" w:eastAsia="Arial" w:hAnsi="Arial"/>
+                <w:b/>
+                <w:bCs/>
+                <w:sz w:val="18"/>
+                <w:szCs w:val="18"/>
+              </w:rPr>
+              <w:t xml:space="preserve">Approach</w:t>
+            </w:r>
+          </w:p>
+        </w:tc>
+        <w:tc>
+          <w:tcPr>
+            <w:tcW w:type="dxa" w:w="1800"/>
+            <w:shd w:fill="D9E6F2" w:val="clear"/>
+            <w:tcMar>
+              <w:top w:type="dxa" w:w="40"/>
+              <w:left w:type="dxa" w:w="80"/>
+              <w:bottom w:type="dxa" w:w="40"/>
+              <w:right w:type="dxa" w:w="80"/>
+            </w:tcMar>
+          </w:tcPr>
+          <w:p>
+            <w:r>
+              <w:rPr>
+                <w:rFonts w:ascii="Arial" w:cs="Arial" w:eastAsia="Arial" w:hAnsi="Arial"/>
+                <w:b/>
+                <w:bCs/>
+                <w:sz w:val="18"/>
+                <w:szCs w:val="18"/>
+              </w:rPr>
+              <w:t xml:space="preserve">Outcome</w:t>
+            </w:r>
+          </w:p>
+        </w:tc>
+        <w:tc>
+          <w:tcPr>
+            <w:tcW w:type="dxa" w:w="5240"/>
+            <w:shd w:fill="D9E6F2" w:val="clear"/>
+            <w:tcMar>
+              <w:top w:type="dxa" w:w="40"/>
+              <w:left w:type="dxa" w:w="80"/>
+              <w:bottom w:type="dxa" w:w="40"/>
+              <w:right w:type="dxa" w:w="80"/>
+            </w:tcMar>
+          </w:tcPr>
+          <w:p>
+            <w:r>
+              <w:rPr>
+                <w:rFonts w:ascii="Arial" w:cs="Arial" w:eastAsia="Arial" w:hAnsi="Arial"/>
+                <w:b/>
+                <w:bCs/>
+                <w:sz w:val="18"/>
+                <w:szCs w:val="18"/>
+              </w:rPr>
+              <w:t xml:space="preserve">Why rejected / replaced</w:t>
+            </w:r>
+          </w:p>
+        </w:tc>
+      </w:tr>
+      <w:tr>
+        <w:tc>
+          <w:tcPr>
+            <w:tcW w:type="dxa" w:w="2600"/>
+            <w:tcMar>
+              <w:top w:type="dxa" w:w="40"/>
+              <w:left w:type="dxa" w:w="80"/>
+              <w:bottom w:type="dxa" w:w="40"/>
+              <w:right w:type="dxa" w:w="80"/>
+            </w:tcMar>
+          </w:tcPr>
+          <w:p>
+            <w:r>
+              <w:rPr>
+                <w:rFonts w:ascii="Arial" w:cs="Arial" w:eastAsia="Arial" w:hAnsi="Arial"/>
+                <w:b w:val="false"/>
+                <w:bCs w:val="false"/>
+                <w:sz w:val="18"/>
+                <w:szCs w:val="18"/>
+              </w:rPr>
+              <w:t xml:space="preserve">t5-small (generic)</w:t>
+            </w:r>
+          </w:p>
+        </w:tc>
+        <w:tc>
+          <w:tcPr>
+            <w:tcW w:type="dxa" w:w="1800"/>
+            <w:tcMar>
+              <w:top w:type="dxa" w:w="40"/>
+              <w:left w:type="dxa" w:w="80"/>
+              <w:bottom w:type="dxa" w:w="40"/>
+              <w:right w:type="dxa" w:w="80"/>
+            </w:tcMar>
+          </w:tcPr>
+          <w:p>
+            <w:r>
+              <w:rPr>
+                <w:rFonts w:ascii="Arial" w:cs="Arial" w:eastAsia="Arial" w:hAnsi="Arial"/>
+                <w:b w:val="false"/>
+                <w:bCs w:val="false"/>
+                <w:sz w:val="18"/>
+                <w:szCs w:val="18"/>
+              </w:rPr>
+              <w:t xml:space="preserve">Safe on memory</w:t>
+            </w:r>
+          </w:p>
+        </w:tc>
+        <w:tc>
+          <w:tcPr>
+            <w:tcW w:type="dxa" w:w="5240"/>
+            <w:tcMar>
+              <w:top w:type="dxa" w:w="40"/>
+              <w:left w:type="dxa" w:w="80"/>
+              <w:bottom w:type="dxa" w:w="40"/>
+              <w:right w:type="dxa" w:w="80"/>
+            </w:tcMar>
+          </w:tcPr>
+          <w:p>
+            <w:r>
+              <w:rPr>
+                <w:rFonts w:ascii="Arial" w:cs="Arial" w:eastAsia="Arial" w:hAnsi="Arial"/>
+                <w:b w:val="false"/>
+                <w:bCs w:val="false"/>
+                <w:sz w:val="18"/>
+                <w:szCs w:val="18"/>
+              </w:rPr>
+              <w:t xml:space="preserve">Copy-pasted raw fragments rather than condensing them</w:t>
+            </w:r>
+          </w:p>
+        </w:tc>
+      </w:tr>
+      <w:tr>
+        <w:tc>
+          <w:tcPr>
+            <w:tcW w:type="dxa" w:w="2600"/>
+            <w:tcMar>
+              <w:top w:type="dxa" w:w="40"/>
+              <w:left w:type="dxa" w:w="80"/>
+              <w:bottom w:type="dxa" w:w="40"/>
+              <w:right w:type="dxa" w:w="80"/>
+            </w:tcMar>
+          </w:tcPr>
+          <w:p>
+            <w:r>
+              <w:rPr>
+                <w:rFonts w:ascii="Arial" w:cs="Arial" w:eastAsia="Arial" w:hAnsi="Arial"/>
+                <w:b w:val="false"/>
+                <w:bCs w:val="false"/>
+                <w:sz w:val="18"/>
+                <w:szCs w:val="18"/>
+              </w:rPr>
+              <w:t xml:space="preserve">bart-large-cnn (~400M)</w:t>
+            </w:r>
+          </w:p>
+        </w:tc>
+        <w:tc>
+          <w:tcPr>
+            <w:tcW w:type="dxa" w:w="1800"/>
+            <w:tcMar>
+              <w:top w:type="dxa" w:w="40"/>
+              <w:left w:type="dxa" w:w="80"/>
+              <w:bottom w:type="dxa" w:w="40"/>
+              <w:right w:type="dxa" w:w="80"/>
+            </w:tcMar>
+          </w:tcPr>
+          <w:p>
+            <w:r>
+              <w:rPr>
+                <w:rFonts w:ascii="Arial" w:cs="Arial" w:eastAsia="Arial" w:hAnsi="Arial"/>
+                <w:b w:val="false"/>
+                <w:bCs w:val="false"/>
+                <w:sz w:val="18"/>
+                <w:szCs w:val="18"/>
+              </w:rPr>
+              <w:t xml:space="preserve">Coherent prose</w:t>
+            </w:r>
+          </w:p>
+        </w:tc>
+        <w:tc>
+          <w:tcPr>
+            <w:tcW w:type="dxa" w:w="5240"/>
+            <w:tcMar>
+              <w:top w:type="dxa" w:w="40"/>
+              <w:left w:type="dxa" w:w="80"/>
+              <w:bottom w:type="dxa" w:w="40"/>
+              <w:right w:type="dxa" w:w="80"/>
+            </w:tcMar>
+          </w:tcPr>
+          <w:p>
+            <w:r>
+              <w:rPr>
+                <w:rFonts w:ascii="Arial" w:cs="Arial" w:eastAsia="Arial" w:hAnsi="Arial"/>
+                <w:b w:val="false"/>
+                <w:bCs w:val="false"/>
+                <w:sz w:val="18"/>
+                <w:szCs w:val="18"/>
+              </w:rPr>
+              <w:t xml:space="preserve">OOM-crashed a live free-tier deployment on first request</w:t>
+            </w:r>
+          </w:p>
+        </w:tc>
+      </w:tr>
+      <w:tr>
+        <w:tc>
+          <w:tcPr>
+            <w:tcW w:type="dxa" w:w="2600"/>
+            <w:tcMar>
+              <w:top w:type="dxa" w:w="40"/>
+              <w:left w:type="dxa" w:w="80"/>
+              <w:bottom w:type="dxa" w:w="40"/>
+              <w:right w:type="dxa" w:w="80"/>
+            </w:tcMar>
+          </w:tcPr>
+          <w:p>
+            <w:r>
+              <w:rPr>
+                <w:rFonts w:ascii="Arial" w:cs="Arial" w:eastAsia="Arial" w:hAnsi="Arial"/>
+                <w:b w:val="false"/>
+                <w:bCs w:val="false"/>
+                <w:sz w:val="18"/>
+                <w:szCs w:val="18"/>
+              </w:rPr>
+              <w:t xml:space="preserve">distilbart-cnn-12-6</w:t>
+            </w:r>
+          </w:p>
+        </w:tc>
+        <w:tc>
+          <w:tcPr>
+            <w:tcW w:type="dxa" w:w="1800"/>
+            <w:tcMar>
+              <w:top w:type="dxa" w:w="40"/>
+              <w:left w:type="dxa" w:w="80"/>
+              <w:bottom w:type="dxa" w:w="40"/>
+              <w:right w:type="dxa" w:w="80"/>
+            </w:tcMar>
+          </w:tcPr>
+          <w:p>
+            <w:r>
+              <w:rPr>
+                <w:rFonts w:ascii="Arial" w:cs="Arial" w:eastAsia="Arial" w:hAnsi="Arial"/>
+                <w:b w:val="false"/>
+                <w:bCs w:val="false"/>
+                <w:sz w:val="18"/>
+                <w:szCs w:val="18"/>
+              </w:rPr>
+              <w:t xml:space="preserve">Never loaded</w:t>
+            </w:r>
+          </w:p>
+        </w:tc>
+        <w:tc>
+          <w:tcPr>
+            <w:tcW w:type="dxa" w:w="5240"/>
+            <w:tcMar>
+              <w:top w:type="dxa" w:w="40"/>
+              <w:left w:type="dxa" w:w="80"/>
+              <w:bottom w:type="dxa" w:w="40"/>
+              <w:right w:type="dxa" w:w="80"/>
+            </w:tcMar>
+          </w:tcPr>
+          <w:p>
+            <w:r>
+              <w:rPr>
+                <w:rFonts w:ascii="Arial" w:cs="Arial" w:eastAsia="Arial" w:hAnsi="Arial"/>
+                <w:b w:val="false"/>
+                <w:bCs w:val="false"/>
+                <w:sz w:val="18"/>
+                <w:szCs w:val="18"/>
+              </w:rPr>
+              <w:t xml:space="preserve">PyTorch-only weights, no TF-native option</w:t>
+            </w:r>
+          </w:p>
+        </w:tc>
+      </w:tr>
+      <w:tr>
+        <w:tc>
+          <w:tcPr>
+            <w:tcW w:type="dxa" w:w="2600"/>
+            <w:tcMar>
+              <w:top w:type="dxa" w:w="40"/>
+              <w:left w:type="dxa" w:w="80"/>
+              <w:bottom w:type="dxa" w:w="40"/>
+              <w:right w:type="dxa" w:w="80"/>
+            </w:tcMar>
+          </w:tcPr>
+          <w:p>
+            <w:r>
+              <w:rPr>
+                <w:rFonts w:ascii="Arial" w:cs="Arial" w:eastAsia="Arial" w:hAnsi="Arial"/>
+                <w:b w:val="false"/>
+                <w:bCs w:val="false"/>
+                <w:sz w:val="18"/>
+                <w:szCs w:val="18"/>
+              </w:rPr>
+              <w:t xml:space="preserve">flan-t5-base</w:t>
+            </w:r>
+          </w:p>
+        </w:tc>
+        <w:tc>
+          <w:tcPr>
+            <w:tcW w:type="dxa" w:w="1800"/>
+            <w:tcMar>
+              <w:top w:type="dxa" w:w="40"/>
+              <w:left w:type="dxa" w:w="80"/>
+              <w:bottom w:type="dxa" w:w="40"/>
+              <w:right w:type="dxa" w:w="80"/>
+            </w:tcMar>
+          </w:tcPr>
+          <w:p>
+            <w:r>
+              <w:rPr>
+                <w:rFonts w:ascii="Arial" w:cs="Arial" w:eastAsia="Arial" w:hAnsi="Arial"/>
+                <w:b w:val="false"/>
+                <w:bCs w:val="false"/>
+                <w:sz w:val="18"/>
+                <w:szCs w:val="18"/>
+              </w:rPr>
+              <w:t xml:space="preserve">Hallucinated</w:t>
+            </w:r>
+          </w:p>
+        </w:tc>
+        <w:tc>
+          <w:tcPr>
+            <w:tcW w:type="dxa" w:w="5240"/>
+            <w:tcMar>
+              <w:top w:type="dxa" w:w="40"/>
+              <w:left w:type="dxa" w:w="80"/>
+              <w:bottom w:type="dxa" w:w="40"/>
+              <w:right w:type="dxa" w:w="80"/>
+            </w:tcMar>
+          </w:tcPr>
+          <w:p>
+            <w:r>
+              <w:rPr>
+                <w:rFonts w:ascii="Arial" w:cs="Arial" w:eastAsia="Arial" w:hAnsi="Arial"/>
+                <w:b w:val="false"/>
+                <w:bCs w:val="false"/>
+                <w:sz w:val="18"/>
+                <w:szCs w:val="18"/>
+              </w:rPr>
+              <w:t xml:space="preserve">Invented a detail ("graphics") not in the source reviews</w:t>
+            </w:r>
+          </w:p>
+        </w:tc>
+      </w:tr>
+      <w:tr>
+        <w:tc>
+          <w:tcPr>
+            <w:tcW w:type="dxa" w:w="2600"/>
+            <w:tcMar>
+              <w:top w:type="dxa" w:w="40"/>
+              <w:left w:type="dxa" w:w="80"/>
+              <w:bottom w:type="dxa" w:w="40"/>
+              <w:right w:type="dxa" w:w="80"/>
+            </w:tcMar>
+          </w:tcPr>
+          <w:p>
+            <w:r>
+              <w:rPr>
+                <w:rFonts w:ascii="Arial" w:cs="Arial" w:eastAsia="Arial" w:hAnsi="Arial"/>
+                <w:b w:val="false"/>
+                <w:bCs w:val="false"/>
+                <w:sz w:val="18"/>
+                <w:szCs w:val="18"/>
+              </w:rPr>
+              <w:t xml:space="preserve">flan-t5-small</w:t>
+            </w:r>
+          </w:p>
+        </w:tc>
+        <w:tc>
+          <w:tcPr>
+            <w:tcW w:type="dxa" w:w="1800"/>
+            <w:tcMar>
+              <w:top w:type="dxa" w:w="40"/>
+              <w:left w:type="dxa" w:w="80"/>
+              <w:bottom w:type="dxa" w:w="40"/>
+              <w:right w:type="dxa" w:w="80"/>
+            </w:tcMar>
+          </w:tcPr>
+          <w:p>
+            <w:r>
+              <w:rPr>
+                <w:rFonts w:ascii="Arial" w:cs="Arial" w:eastAsia="Arial" w:hAnsi="Arial"/>
+                <w:b w:val="false"/>
+                <w:bCs w:val="false"/>
+                <w:sz w:val="18"/>
+                <w:szCs w:val="18"/>
+              </w:rPr>
+              <w:t xml:space="preserve">Vague, one-sided</w:t>
+            </w:r>
+          </w:p>
+        </w:tc>
+        <w:tc>
+          <w:tcPr>
+            <w:tcW w:type="dxa" w:w="5240"/>
+            <w:tcMar>
+              <w:top w:type="dxa" w:w="40"/>
+              <w:left w:type="dxa" w:w="80"/>
+              <w:bottom w:type="dxa" w:w="40"/>
+              <w:right w:type="dxa" w:w="80"/>
+            </w:tcMar>
+          </w:tcPr>
+          <w:p>
+            <w:r>
+              <w:rPr>
+                <w:rFonts w:ascii="Arial" w:cs="Arial" w:eastAsia="Arial" w:hAnsi="Arial"/>
+                <w:b w:val="false"/>
+                <w:bCs w:val="false"/>
+                <w:sz w:val="18"/>
+                <w:szCs w:val="18"/>
+              </w:rPr>
+              <w:t xml:space="preserve">Ignored negative reviews, produced generic praise</w:t>
+            </w:r>
+          </w:p>
+        </w:tc>
+      </w:tr>
+      <w:tr>
+        <w:tc>
+          <w:tcPr>
+            <w:tcW w:type="dxa" w:w="2600"/>
+            <w:tcMar>
+              <w:top w:type="dxa" w:w="40"/>
+              <w:left w:type="dxa" w:w="80"/>
+              <w:bottom w:type="dxa" w:w="40"/>
+              <w:right w:type="dxa" w:w="80"/>
+            </w:tcMar>
+          </w:tcPr>
+          <w:p>
+            <w:r>
+              <w:rPr>
+                <w:rFonts w:ascii="Arial" w:cs="Arial" w:eastAsia="Arial" w:hAnsi="Arial"/>
+                <w:b w:val="false"/>
+                <w:bCs w:val="false"/>
+                <w:sz w:val="18"/>
+                <w:szCs w:val="18"/>
+              </w:rPr>
+              <w:t xml:space="preserve">TF-IDF (extractive)</w:t>
+            </w:r>
+          </w:p>
+        </w:tc>
+        <w:tc>
+          <w:tcPr>
+            <w:tcW w:type="dxa" w:w="1800"/>
+            <w:tcMar>
+              <w:top w:type="dxa" w:w="40"/>
+              <w:left w:type="dxa" w:w="80"/>
+              <w:bottom w:type="dxa" w:w="40"/>
+              <w:right w:type="dxa" w:w="80"/>
+            </w:tcMar>
+          </w:tcPr>
+          <w:p>
+            <w:r>
+              <w:rPr>
+                <w:rFonts w:ascii="Arial" w:cs="Arial" w:eastAsia="Arial" w:hAnsi="Arial"/>
+                <w:b w:val="false"/>
+                <w:bCs w:val="false"/>
+                <w:sz w:val="18"/>
+                <w:szCs w:val="18"/>
+              </w:rPr>
+              <w:t xml:space="preserve">Safe, grounded</w:t>
+            </w:r>
+          </w:p>
+        </w:tc>
+        <w:tc>
+          <w:tcPr>
+            <w:tcW w:type="dxa" w:w="5240"/>
+            <w:tcMar>
+              <w:top w:type="dxa" w:w="40"/>
+              <w:left w:type="dxa" w:w="80"/>
+              <w:bottom w:type="dxa" w:w="40"/>
+              <w:right w:type="dxa" w:w="80"/>
+            </w:tcMar>
+          </w:tcPr>
+          <w:p>
+            <w:r>
+              <w:rPr>
+                <w:rFonts w:ascii="Arial" w:cs="Arial" w:eastAsia="Arial" w:hAnsi="Arial"/>
+                <w:b w:val="false"/>
+                <w:bCs w:val="false"/>
+                <w:sz w:val="18"/>
+                <w:szCs w:val="18"/>
+              </w:rPr>
+              <w:t xml:space="preserve">Couldn't produce real prose, phrase-list only</w:t>
+            </w:r>
+          </w:p>
+        </w:tc>
+      </w:tr>
+      <w:tr>
+        <w:tc>
+          <w:tcPr>
+            <w:tcW w:type="dxa" w:w="2600"/>
+            <w:tcMar>
+              <w:top w:type="dxa" w:w="40"/>
+              <w:left w:type="dxa" w:w="80"/>
+              <w:bottom w:type="dxa" w:w="40"/>
+              <w:right w:type="dxa" w:w="80"/>
+            </w:tcMar>
+          </w:tcPr>
+          <w:p>
+            <w:r>
+              <w:rPr>
+                <w:rFonts w:ascii="Arial" w:cs="Arial" w:eastAsia="Arial" w:hAnsi="Arial"/>
+                <w:b w:val="false"/>
+                <w:bCs w:val="false"/>
+                <w:sz w:val="18"/>
+                <w:szCs w:val="18"/>
+              </w:rPr>
+              <w:t xml:space="preserve">Falconsai/text_summarization (deployed)</w:t>
+            </w:r>
+          </w:p>
+        </w:tc>
+        <w:tc>
+          <w:tcPr>
+            <w:tcW w:type="dxa" w:w="1800"/>
+            <w:tcMar>
+              <w:top w:type="dxa" w:w="40"/>
+              <w:left w:type="dxa" w:w="80"/>
+              <w:bottom w:type="dxa" w:w="40"/>
+              <w:right w:type="dxa" w:w="80"/>
+            </w:tcMar>
+          </w:tcPr>
+          <w:p>
+            <w:r>
+              <w:rPr>
+                <w:rFonts w:ascii="Arial" w:cs="Arial" w:eastAsia="Arial" w:hAnsi="Arial"/>
+                <w:b w:val="false"/>
+                <w:bCs w:val="false"/>
+                <w:sz w:val="18"/>
+                <w:szCs w:val="18"/>
+              </w:rPr>
+              <w:t xml:space="preserve">Deployed</w:t>
+            </w:r>
+          </w:p>
+        </w:tc>
+        <w:tc>
+          <w:tcPr>
+            <w:tcW w:type="dxa" w:w="5240"/>
+            <w:tcMar>
+              <w:top w:type="dxa" w:w="40"/>
+              <w:left w:type="dxa" w:w="80"/>
+              <w:bottom w:type="dxa" w:w="40"/>
+              <w:right w:type="dxa" w:w="80"/>
+            </w:tcMar>
+          </w:tcPr>
+          <w:p>
+            <w:r>
+              <w:rPr>
+                <w:rFonts w:ascii="Arial" w:cs="Arial" w:eastAsia="Arial" w:hAnsi="Arial"/>
+                <w:b w:val="false"/>
+                <w:bCs w:val="false"/>
+                <w:sz w:val="18"/>
+                <w:szCs w:val="18"/>
+              </w:rPr>
+              <w:t xml:space="preserve">Same memory class as t5-small, fine-tuned for the task</w:t>
+            </w:r>
+          </w:p>
+        </w:tc>
+      </w:tr>
+    </w:tbl>
+    <w:p>
+      <w:pPr>
+        <w:spacing w:after="80"/>
+      </w:pPr>
+      <w:r>
+        <w:rPr>
+          <w:rFonts w:ascii="Arial" w:cs="Arial" w:eastAsia="Arial" w:hAnsi="Arial"/>
+          <w:sz w:val="20"/>
+          <w:szCs w:val="20"/>
+        </w:rPr>
+        <w:t xml:space="preserve">One problem remained even after landing on Falconsai/text_summarization: summarizing several reviews in a single pass reliably dropped at least one review from the output entirely, the same failure mode that sank the original t5-small. The fix was method, not model — each kept review is summarized individually, then the short results are joined, guaranteeing every review is represented since none can be dropped once each gets its own generation pass.</w:t>
       </w:r>
     </w:p>
     <w:p>

</xml_diff>

<commit_message>
Add Falconsai selection evidence (memory profiling, hallucination checks) to documentation
</commit_message>
<xml_diff>
--- a/Project_Documentation.docx
+++ b/Project_Documentation.docx
@@ -3372,12 +3372,25 @@
                 <w:sz w:val="18"/>
                 <w:szCs w:val="18"/>
               </w:rPr>
-              <w:t xml:space="preserve">Same memory class as t5-small, fine-tuned for the task</w:t>
+              <w:t xml:space="preserve">60.5M params / 242MB — same memory class as generic t5-small, but fine-tuned specifically for summarization</w:t>
             </w:r>
           </w:p>
         </w:tc>
       </w:tr>
     </w:tbl>
+    <w:p>
+      <w:pPr>
+        <w:spacing w:after="80"/>
+      </w:pPr>
+      <w:r>
+        <w:rPr>
+          <w:rFonts w:ascii="Arial" w:cs="Arial" w:eastAsia="Arial" w:hAnsi="Arial"/>
+          <w:sz w:val="20"/>
+          <w:szCs w:val="20"/>
+        </w:rPr>
+        <w:t xml:space="preserve">Why this one, with evidence, not just elimination: local memory profiling (test_summarizer_memory.py, run against real Helldivers 2 reviews) showed the model loading at ~764MB and peaking at ~1053MB resident memory — comfortably inside the free-tier host's budget that had already OOM-crashed bart-large-cnn on its first real request. Across three separate local test runs, generated output showed no fabricated detail traceable to any source review — the same check that had caught flan-t5-base inventing "graphics" out of nothing. Falconsai was reached for specifically, not by accident, because it is a t5-small-class checkpoint (matching the model already proven safe on memory) but fine-tuned for summarization rather than generic multi-task text-to-text — that combination is what the other six attempts didn't have.</w:t>
+      </w:r>
+    </w:p>
     <w:p>
       <w:pPr>
         <w:spacing w:after="80"/>

</xml_diff>

<commit_message>
Add AI-assistance disclosure; show Steam game art above results
</commit_message>
<xml_diff>
--- a/Project_Documentation.docx
+++ b/Project_Documentation.docx
@@ -47,6 +47,22 @@
           <w:szCs w:val="16"/>
         </w:rPr>
         <w:t xml:space="preserve">Author: Sean C.   |   Repo: github.com/brighthikaru/steam-review-filter-and-score   |   Live app: steam-review-filter-and-score.streamlit.app</w:t>
+      </w:r>
+    </w:p>
+    <w:p>
+      <w:pPr>
+        <w:spacing w:after="80"/>
+      </w:pPr>
+      <w:r>
+        <w:rPr>
+          <w:rFonts w:ascii="Arial" w:cs="Arial" w:eastAsia="Arial" w:hAnsi="Arial"/>
+          <w:i/>
+          <w:iCs/>
+          <w:color w:val="444444"/>
+          <w:sz w:val="17"/>
+          <w:szCs w:val="17"/>
+        </w:rPr>
+        <w:t xml:space="preserve">AI assistance disclosure: the summarization component (model selection/testing across seven attempts, and the per-review-then-join method described under Model 3 in Section 8) and the Streamlit app (UI and deployment) were built with assistance from Claude (Anthropic), used as a coding assistant since I had no prior experience with generative summarization models or app deployment. The core data science work -- EDA (Section 7) and the Model 1/Model 2 comparisons in Section 8 -- is my own.</w:t>
       </w:r>
     </w:p>
     <w:p>

</xml_diff>

<commit_message>
Simplify wording, fix AU spelling across notebook/docs/presentation
</commit_message>
<xml_diff>
--- a/Project_Documentation.docx
+++ b/Project_Documentation.docx
@@ -62,7 +62,7 @@
           <w:sz w:val="17"/>
           <w:szCs w:val="17"/>
         </w:rPr>
-        <w:t xml:space="preserve">AI assistance disclosure: the summarization component (model selection/testing across seven attempts, and the per-review-then-join method described under Model 3 in Section 8) and the Streamlit app (UI and deployment) were built with assistance from Claude (Anthropic), used as a coding assistant since I had no prior experience with generative summarization models or app deployment. The core data science work -- EDA (Section 7) and the Model 1/Model 2 comparisons in Section 8 -- is my own.</w:t>
+        <w:t xml:space="preserve">AI assistance disclosure: the pipeline, summarisation component (model selection/testing across seven attempts, and the per-review-then-join method described under Model 3 in Section 8) and the Streamlit app (UI and deployment) were built with assistance from Claude (Anthropic), used as a coding assistant since I had little experience with generative summarisation models or app deployment. The core data science work -- EDA (Section 7) and the Model 1/Model 2 comparisons in Section 8 -- is my own.</w:t>
       </w:r>
     </w:p>
     <w:p>
@@ -92,7 +92,7 @@
           <w:sz w:val="20"/>
           <w:szCs w:val="20"/>
         </w:rPr>
-        <w:t xml:space="preserve">A one-word Steam review — "good game," "bad," "10/10" — records a vote but explains nothing: no gameplay mechanics, no bugs, no pacing, nothing that helps another player judge whether the game is actually for them. These thin reviews sit alongside genuinely informative ones at roughly equal visibility in Steam's review list, and both count identically toward the aggregate score. That makes it harder for a prospective buyer to find the reviews that would actually inform a purchase decision, and harder for developers to separate substantive feedback from noise. Steam applies some internal filtering, but never surfaces the substantive reviews specifically, nor a "real sentiment" number. Left unaddressed, purchase decisions and developer feedback both rest on a review list where detail is buried rather than surfaced. No published prior work solving this specific problem for Steam was identified.</w:t>
+        <w:t xml:space="preserve">A one-word Steam review — "good game," "bad," "10/10" — records a vote but explains nothing: no gameplay mechanics, no bugs, no pacing, nothing that helps another player judge whether the game is actually for them. These thin reviews sit alongside reviews that actually say something, at roughly equal visibility in Steam's review list, and both count identically toward the aggregate score. That makes it harder for a prospective buyer to find the reviews that would actually inform a purchase decision, and harder for developers to separate real feedback from noise. Steam applies some internal filtering, but it never specifically makes the useful reviews easy to find, nor gives a "real sentiment" number. Left unaddressed, purchase decisions and developer feedback both rest on a review list where the detail is buried rather than easy to find. No published prior work solving this specific problem for Steam was identified.</w:t>
       </w:r>
     </w:p>
     <w:p>
@@ -175,7 +175,7 @@
           <w:sz w:val="20"/>
           <w:szCs w:val="20"/>
         </w:rPr>
-        <w:t xml:space="preserve">Developers and publishers — want genuine, substantive feedback surfaced clearly, especially after a patch, price change, or controversy, when low-effort review volume spikes.</w:t>
+        <w:t xml:space="preserve">Developers and publishers — want genuine feedback made easy to find, especially after a patch, price change, or controversy, when low-effort review volume spikes.</w:t>
       </w:r>
     </w:p>
     <w:p>
@@ -193,7 +193,7 @@
           <w:sz w:val="20"/>
           <w:szCs w:val="20"/>
         </w:rPr>
-        <w:t xml:space="preserve">Steam itself — already filters some abuse; surfacing the substantive reviews specifically, plus a transparent text-only "real sentiment" score, is a natural extension its own review list doesn't currently provide.</w:t>
+        <w:t xml:space="preserve">Steam itself — already filters some abuse; making the useful reviews easy to find specifically, plus a transparent text-only "real sentiment" score, is a natural extension its own review list doesn't currently provide.</w:t>
       </w:r>
     </w:p>
     <w:p>
@@ -223,7 +223,7 @@
           <w:sz w:val="20"/>
           <w:szCs w:val="20"/>
         </w:rPr>
-        <w:t xml:space="preserve">Can the substantive reviews for a game be surfaced and the low-effort/junk ones filtered out, using nothing but the review text, so a player gets real detail to inform a buying decision? A secondary, supporting question: does that same filtering produce a "real sentiment" score that reflects genuine community sentiment more accurately than the raw aggregate? To be useful in practice, the quality filter needs precision high enough that genuine, substantive reviews are rarely misclassified as junk, and the sentiment model needs to track a reviewer's real vote closely enough to work as a trustworthy proxy where a vote isn't available. Section 8 covers how both models measure up against that bar.</w:t>
+        <w:t xml:space="preserve">Can we make the useful reviews easy to find and filter out the low-effort/junk ones, using nothing but the review text, so a player gets real detail to inform a buying decision? A secondary, supporting question: does that same filtering produce a "real sentiment" score that reflects genuine community sentiment more accurately than the raw aggregate? To be useful in practice, the quality filter needs precision high enough that genuine reviews are rarely misclassified as junk, and the sentiment model needs to track a reviewer's real vote closely enough to work as a trustworthy proxy where a vote isn't available. Section 8 covers how both models measure up against that bar.</w:t>
       </w:r>
     </w:p>
     <w:p>
@@ -253,7 +253,7 @@
           <w:sz w:val="20"/>
           <w:szCs w:val="20"/>
         </w:rPr>
-        <w:t xml:space="preserve">Does review text alone carry a generalisable signal for (a) sentiment and (b) review quality, and does that signal hold across genuinely different games and genres — not just the ones a model was trained on?</w:t>
+        <w:t xml:space="preserve">Can the model learn from text alone, and does it still work on games it wasn't trained on — for (a) sentiment and (b) review quality, across genuinely different games and genres?</w:t>
       </w:r>
     </w:p>
     <w:p>
@@ -283,7 +283,7 @@
           <w:sz w:val="20"/>
           <w:szCs w:val="20"/>
         </w:rPr>
-        <w:t xml:space="preserve">140,000 reviews across 7 games, 20,000 each, pulled live from Steam's public appreviews API (no key required, cursor-paginated). Games were chosen to span distinct genres so the results are not just an artefact of one community's writing style:</w:t>
+        <w:t xml:space="preserve">140,000 reviews across 7 games, 20,000 each, pulled live from Steam's public appreviews API (no key required, cursor-paginated). Games were chosen to span distinct genres so the results aren't just picking up how one game's players happen to write:</w:t>
       </w:r>
     </w:p>
     <w:tbl>
@@ -2789,7 +2789,7 @@
           <w:sz w:val="24"/>
           <w:szCs w:val="24"/>
         </w:rPr>
-        <w:t xml:space="preserve">Model 3 — Summarization (bonus, beyond the two required)</w:t>
+        <w:t xml:space="preserve">Model 3 — Summarisation (bonus, beyond the two required)</w:t>
       </w:r>
     </w:p>
     <w:p>
@@ -3388,7 +3388,7 @@
                 <w:sz w:val="18"/>
                 <w:szCs w:val="18"/>
               </w:rPr>
-              <w:t xml:space="preserve">60.5M params / 242MB — same memory class as generic t5-small, but fine-tuned specifically for summarization</w:t>
+              <w:t xml:space="preserve">60.5M params / 242MB — same memory class as generic t5-small, but fine-tuned specifically for summarisation</w:t>
             </w:r>
           </w:p>
         </w:tc>
@@ -3404,7 +3404,7 @@
           <w:sz w:val="20"/>
           <w:szCs w:val="20"/>
         </w:rPr>
-        <w:t xml:space="preserve">Why this one, with evidence, not just elimination: local memory profiling (test_summarizer_memory.py, run against real Helldivers 2 reviews) showed the model loading at ~764MB and peaking at ~1053MB resident memory — comfortably inside the free-tier host's budget that had already OOM-crashed bart-large-cnn on its first real request. Across three separate local test runs, generated output showed no fabricated detail traceable to any source review — the same check that had caught flan-t5-base inventing "graphics" out of nothing. Falconsai was reached for specifically, not by accident, because it is a t5-small-class checkpoint (matching the model already proven safe on memory) but fine-tuned for summarization rather than generic multi-task text-to-text — that combination is what the other six attempts didn't have.</w:t>
+        <w:t xml:space="preserve">Why this one, with evidence, not just elimination: local memory profiling (test_summarizer_memory.py, run against real Helldivers 2 reviews) showed the model loading at ~764MB and peaking at ~1053MB resident memory — comfortably inside the free-tier host's budget that had already OOM-crashed bart-large-cnn on its first real request. Across three separate local test runs, generated output showed no fabricated detail traceable to any source review — the same check that had caught flan-t5-base inventing "graphics" out of nothing. Falconsai was reached for specifically, not by accident, because it is a t5-small-class checkpoint (matching the model already proven safe on memory) but fine-tuned for summarisation rather than generic multi-task text-to-text — that combination is what the other six attempts didn't have.</w:t>
       </w:r>
     </w:p>
     <w:p>
@@ -3417,7 +3417,7 @@
           <w:sz w:val="20"/>
           <w:szCs w:val="20"/>
         </w:rPr>
-        <w:t xml:space="preserve">One problem remained even after landing on Falconsai/text_summarization: summarizing several reviews in a single pass reliably dropped at least one review from the output entirely, the same failure mode that sank the original t5-small. The fix was method, not model — each kept review is summarized individually, then the short results are joined, guaranteeing every review is represented since none can be dropped once each gets its own generation pass.</w:t>
+        <w:t xml:space="preserve">One problem remained even after landing on Falconsai/text_summarization: summarising several reviews in a single pass reliably dropped at least one review from the output entirely, the same failure mode that sank the original t5-small. The fix was method, not model — each kept review is summarised individually, then the short results are joined, guaranteeing every review is represented since none can be dropped once each gets its own generation pass.</w:t>
       </w:r>
     </w:p>
     <w:p>
@@ -3447,7 +3447,7 @@
           <w:sz w:val="20"/>
           <w:szCs w:val="20"/>
         </w:rPr>
-        <w:t xml:space="preserve">The quality filter reliably separates thin, low-information reviews from substantive ones, which lets the app surface real detail to a prospective buyer instead of a raw, unsorted review list. As a secondary check on that filtering, the positive percentage drops for every one of the seven games once low-effort reviews are removed — a consistent, non-obvious finding, because low-effort reviews skew more positive than substantive ones. Tekken 8 crosses a full Steam category ("Mixed" → "Mostly Negative", 47.6% → 39.2%), and so does Forza Horizon 5 ("Very Positive" → "Mostly Positive", 88.7% → 79.7%). The sentiment model's text-only prediction agrees with the reviewer's real vote 82–96% of the time depending on the game, confirming it is reading sentiment correctly rather than guessing.</w:t>
+        <w:t xml:space="preserve">The quality filter reliably separates thin, low-information reviews from the ones with real detail, which lets the app show that detail to a prospective buyer instead of a raw, unsorted review list. As a secondary check on that filtering, the positive percentage drops for every one of the seven games once low-effort reviews are removed — a consistent, non-obvious finding, because low-effort reviews skew more positive than detailed ones. Tekken 8 crosses a full Steam category ("Mixed" → "Mostly Negative", 47.6% → 39.2%), and so does Forza Horizon 5 ("Very Positive" → "Mostly Positive", 88.7% → 79.7%). The sentiment model's text-only prediction agrees with the reviewer's real vote 82–96% of the time depending on the game, confirming it is reading sentiment correctly rather than guessing.</w:t>
       </w:r>
     </w:p>
     <w:p>
@@ -3477,7 +3477,7 @@
           <w:sz w:val="20"/>
           <w:szCs w:val="20"/>
         </w:rPr>
-        <w:t xml:space="preserve">The two required models are packaged as portable artifacts — the CNN quality filter as a single .keras file (its vocabulary is baked into the model, so no separate vectorizer is needed at inference time), and the Stacking sentiment model plus its TF-IDF vectorizer as joblib files. The summarizer downloads its own pretrained weights (Falconsai/text_summarization, 242MB) from Hugging Face on first load rather than using a locally-trained artifact. The Streamlit app loads all three models and, for any game someone searches, pulls fresh reviews live, drops non-English content, and scores with both required models. The headline UI elements are the "players liked/disliked" generated summary and a curated sample of the longest substantive reviews on each side of the vote — the ones with enough detail to actually inform a buying decision — shown alongside the before/after sentiment score (led by Steam's own category label, e.g. "Mostly Positive", rather than the raw percentage) and model-vs-Steam-vote comparison. Per-request inference (~65ms for a 1,000-review batch) is negligible next to the multi-second Steam API call the app already makes; the summarizer only ever runs on the ~6 already-filtered reviews shown in the UI, not the full batch. No GPU is needed in production — the CPU build of TensorFlow keeps the deployed footprint small enough for a free-tier host.</w:t>
+        <w:t xml:space="preserve">The two required models are packaged as portable artefacts — the CNN quality filter as a single .keras file (its vocabulary is baked into the model, so no separate vectorizer is needed at inference time), and the Stacking sentiment model plus its TF-IDF vectorizer as joblib files. The summariser downloads its own pretrained weights (Falconsai/text_summarization, 242MB) from Hugging Face on first load rather than using a locally-trained artefact. The Streamlit app loads all three models and, for any game someone searches, pulls fresh reviews live, drops non-English content, and scores with both required models. The headline UI elements are the "players liked/disliked" generated summary and a curated sample of the longest, most detailed reviews on each side of the vote — the ones with enough detail to actually inform a buying decision — shown alongside the before/after sentiment score (led by Steam's own category label, e.g. "Mostly Positive", rather than the raw percentage) and model-vs-Steam-vote comparison. Per-request inference (~65ms for a 1,000-review batch) is negligible next to the multi-second Steam API call the app already makes; the summariser only ever runs on the ~6 already-filtered reviews shown in the UI, not the full batch. No GPU is needed in production — the CPU build of TensorFlow keeps the deployed footprint small enough for a free-tier host.</w:t>
       </w:r>
     </w:p>
     <w:p>
@@ -3507,7 +3507,7 @@
           <w:sz w:val="20"/>
           <w:szCs w:val="20"/>
         </w:rPr>
-        <w:t xml:space="preserve">Review text alone turns out to carry a generalisable signal for both quality and sentiment, and that signal held up across genuinely different genres, not just the ones each model was tuned on. Confidence is highest for the quality filter, where precision sits in a tight 0.90–0.96 band across all seven games, including Cyberpunk 2077's open-world RPG reviews — the style least represented in the dataset. Sentiment is a moderate-to-high confidence result: the contest between model families was closer here, but the deployed model's agreement with Steam's real vote stayed consistently ahead of the alternatives across games.</w:t>
+        <w:t xml:space="preserve">Review text alone turned out to be enough for both quality and sentiment, and that held up across genuinely different genres, not just the ones each model was tuned on. Confidence is highest for the quality filter, where precision sits in a tight 0.90–0.96 band across all seven games, including Cyberpunk 2077's open-world RPG reviews — the style least represented in the dataset. Sentiment is a moderate-to-high confidence result: the contest between model families was closer here, but the deployed model's agreement with Steam's real vote stayed consistently ahead of the alternatives across games.</w:t>
       </w:r>
     </w:p>
     <w:p>
@@ -3537,7 +3537,7 @@
           <w:sz w:val="20"/>
           <w:szCs w:val="20"/>
         </w:rPr>
-        <w:t xml:space="preserve">Yes — the quality filter can reliably separate substantive reviews from thin ones, letting the app surface real detail (gameplay, bugs, pacing, value) instead of a raw, unsorted list. The resulting "real sentiment" score is a useful secondary check: it reads consistently more critically than Steam's raw score once low-effort noise is removed. That comes with a caveat worth stating plainly: the filter rests on a proxy label for "low-effort" rather than verified ground truth, and the sample reflects recent reviews rather than a game's full history. Read that way, this is a tool for finding informative reviews and getting a more honest sentiment snapshot — not a wholesale replacement for Steam's own aggregate.</w:t>
+        <w:t xml:space="preserve">Yes — the quality filter can reliably separate the reviews with real detail from the thin ones, letting the app show that detail (gameplay, bugs, pacing, value) instead of a raw, unsorted list. The resulting "real sentiment" score is a useful secondary check: it reads consistently more critically than Steam's raw score once low-effort noise is removed. That comes with a caveat worth stating plainly: the filter rests on a proxy label for "low-effort" rather than verified ground truth, and the sample reflects recent reviews rather than a game's full history. Read that way, this is a tool for finding informative reviews and getting a more honest sentiment snapshot — not a wholesale replacement for Steam's own aggregate.</w:t>
       </w:r>
     </w:p>
     <w:p>
@@ -3572,7 +3572,7 @@
           <w:sz w:val="20"/>
           <w:szCs w:val="20"/>
         </w:rPr>
-        <w:t xml:space="preserve">Players: read the surfaced substantive reviews first for actual buying-decision detail, and use the filtered score alongside Steam's own as a secondary check — especially useful right after a patch, price change, or controversy, when low-effort review volume spikes and the raw score is most likely to be misleading.</w:t>
+        <w:t xml:space="preserve">Players: read the detailed reviews the app shows first for actual buying-decision detail, and use the filtered score alongside Steam's own as a secondary check — especially useful right after a patch, price change, or controversy, when low-effort review volume spikes and the raw score is most likely to be misleading.</w:t>
       </w:r>
     </w:p>
     <w:p>
@@ -3590,7 +3590,7 @@
           <w:sz w:val="20"/>
           <w:szCs w:val="20"/>
         </w:rPr>
-        <w:t xml:space="preserve">Developers/publishers: the surfaced substantive reviews and the filtered score give a clearer read on genuine feedback than the raw aggregate, without needing to read thousands of reviews manually.</w:t>
+        <w:t xml:space="preserve">Developers/publishers: the detailed reviews the app shows, plus the filtered score, give a clearer read on genuine feedback than the raw aggregate, without needing to read thousands of reviews manually.</w:t>
       </w:r>
     </w:p>
     <w:p>
@@ -3608,7 +3608,7 @@
           <w:sz w:val="20"/>
           <w:szCs w:val="20"/>
         </w:rPr>
-        <w:t xml:space="preserve">Recommendation: treat this as a decision-support signal, not a single ground-truth number — the underlying label is a proxy, and results are scoped to English-language reviews.</w:t>
+        <w:t xml:space="preserve">Recommendation: treat this as something to help you decide, not a single correct number — the underlying label is a proxy, and results are scoped to English-language reviews.</w:t>
       </w:r>
     </w:p>
     <w:p>
@@ -3638,7 +3638,7 @@
           <w:sz w:val="20"/>
           <w:szCs w:val="20"/>
         </w:rPr>
-        <w:t xml:space="preserve">UI: Streamlit web app (game name or appid search, curated sample of substantive reviews on each side of the vote, before/after sentiment comparison, flagged-review sample for transparency). Model: CNN (quality) + Stacking ensemble (sentiment), both trained via a reproducible src/train_models.py pipeline separated from the exploratory notebook. Data: Steam's public appreviews API, pulled live for any game, no re-training needed for new titles. Infrastructure: GitHub for source control and CI-free redeploy-on-push; Streamlit Community Cloud for hosting (free tier, sleeps when idle). Tools/libraries: Python, pandas, scikit-learn, TensorFlow/Keras, Streamlit, requests.</w:t>
+        <w:t xml:space="preserve">UI: Streamlit web app (game name or appid search, curated sample of detailed reviews on each side of the vote, before/after sentiment comparison, flagged-review sample for transparency). Model: CNN (quality) + Stacking ensemble (sentiment), both trained via a reproducible src/train_models.py pipeline separated from the exploratory notebook. Data: Steam's public appreviews API, pulled live for any game, no re-training needed for new titles. Infrastructure: GitHub for source control and CI-free redeploy-on-push; Streamlit Community Cloud for hosting (free tier, sleeps when idle). Tools/libraries: Python, pandas, scikit-learn, TensorFlow/Keras, Streamlit, requests.</w:t>
       </w:r>
     </w:p>
     <w:p>
@@ -3727,7 +3727,7 @@
           <w:sz w:val="20"/>
           <w:szCs w:val="20"/>
         </w:rPr>
-        <w:t xml:space="preserve">The "Players liked/disliked" summary is generated text (Falconsai/text_summarization, pulled from the ~6 longest kept reviews per game, not run across the full pulled batch), not extracted phrases — local testing across multiple runs showed no outright hallucination, but as generated prose it carries a weaker groundedness guarantee than literal extraction would. Each review is summarized individually and the results joined, so the output reads as several short sentences placed back-to-back rather than one fully unified paragraph — a deliberate trade-off to guarantee every review is represented.</w:t>
+        <w:t xml:space="preserve">The "Players liked/disliked" summary is generated text (Falconsai/text_summarization, pulled from the ~6 longest kept reviews per game, not run across the full pulled batch), not extracted phrases — local testing across multiple runs showed no outright hallucination, but as generated prose it carries a weaker groundedness guarantee than literal extraction would. Each review is summarised individually and the results joined, so the output reads as several short sentences placed back-to-back rather than one fully unified paragraph — a deliberate trade-off to guarantee every review is represented.</w:t>
       </w:r>
     </w:p>
     <w:p>
@@ -3763,7 +3763,7 @@
           <w:sz w:val="20"/>
           <w:szCs w:val="20"/>
         </w:rPr>
-        <w:t xml:space="preserve">Next (summarization): a summarizer that synthesizes across multiple reviews in one coherent pass, rather than joining independently-generated per-review summaries — the per-review approach was chosen deliberately to guarantee no review gets dropped, at some cost to how naturally the joined result flows. Five summarizer models were tried in total to reach the current approach (t5-small, bart-large-cnn, distilbart-cnn-12-6, flan-t5, and an interim extractive TF-IDF approach) before Falconsai/text_summarization was adopted.</w:t>
+        <w:t xml:space="preserve">Next (summarisation): a summariser that synthesises across multiple reviews in one coherent pass, rather than joining independently-generated per-review summaries — the per-review approach was chosen deliberately to guarantee no review gets dropped, at some cost to how naturally the joined result flows. Five summariser models were tried in total to reach the current approach (t5-small, bart-large-cnn, distilbart-cnn-12-6, flan-t5, and an interim extractive TF-IDF approach) before Falconsai/text_summarization was adopted.</w:t>
       </w:r>
     </w:p>
     <w:p>
@@ -3781,7 +3781,7 @@
           <w:sz w:val="20"/>
           <w:szCs w:val="20"/>
         </w:rPr>
-        <w:t xml:space="preserve">Next (scope): extend filtering and summarization to the full pulled batch (up to 1,000 reviews), not just the curated ~6-review sample shown today. This was the original goal behind the summarization feature — giving a picture of what players broadly say, not just a handful of the longest reviews — and closing that gap is the clearest way to fully meet it.</w:t>
+        <w:t xml:space="preserve">Next (scope): extend filtering and summarisation to the full pulled batch (up to 1,000 reviews), not just the curated ~6-review sample shown today. This was the original goal behind the summarisation feature — giving a picture of what players broadly say, not just a handful of the longest reviews — and closing that gap is the clearest way to fully meet it.</w:t>
       </w:r>
     </w:p>
     <w:p>

</xml_diff>